<commit_message>
SAM report: populate Inputs file names (Weather Data, Module/Inverter Datasheet)
The Inputs reference list showed static labels — "Weather Data:" was a dangling
label and the datasheet lines had no values. Now data-driven:
- Weather Data: NSRDB weather filename (pysam solar_resource_file basename),
  falling back to a generic NSRDB reference when there's no pysam.
- Module/Inverter Datasheet: the module/inverter model.
Added an editable "Weather data" field on the report form; new «WEATHER_FILE»
token; report_template.docx patched (+build_template.py kept in sync).

The narrative "N simulations from YYYY to YYYY" was already dynamic (unchanged).

Also removed the redundant top "Revision" 0-3 dropdown (the header REVISION area
is a static 0|1|2|3 legend and the "Save as" version control is what sets the
filed revision). Resolved the router generate flow to check the project link
before generating.

Co-Authored-By: Claude Opus 4.8 <noreply@anthropic.com>
</commit_message>
<xml_diff>
--- a/app/modules/sam_report/assets/report_template.docx
+++ b/app/modules/sam_report/assets/report_template.docx
@@ -1609,7 +1609,7 @@
           <w:rFonts w:ascii="Jost" w:hAnsi="Jost"/>
           <w:sz w:val="22"/>
         </w:rPr>
-        <w:t>Module Datasheet</w:t>
+        <w:t>Module Datasheet: «MODULE_MODEL»</w:t>
       </w:r>
     </w:p>
     <w:p>
@@ -1636,7 +1636,7 @@
           <w:rFonts w:ascii="Jost" w:hAnsi="Jost"/>
           <w:sz w:val="22"/>
         </w:rPr>
-        <w:t xml:space="preserve">Inverter Datasheet </w:t>
+        <w:t xml:space="preserve">Inverter Datasheet: «INVERTER_MODEL»</w:t>
       </w:r>
     </w:p>
     <w:p>
@@ -1690,7 +1690,7 @@
           <w:rFonts w:ascii="Jost" w:hAnsi="Jost"/>
           <w:sz w:val="22"/>
         </w:rPr>
-        <w:t>Weather Data:</w:t>
+        <w:t>Weather Data: «WEATHER_FILE»</w:t>
       </w:r>
     </w:p>
     <w:p>

</xml_diff>

<commit_message>
SAM report: show the actual filed revision in the header
The header REVISION area was a static 0|1|2|3 legend. Merge the four value cells
into one gridSpan-4 cell bound to «REVISION», so the header shows the real filed
revision number (any value, not just 0-3).

The revision is computed before generation (reissue -> that rev; new ->
next_rev_number), baked into the docx, and PINNED at filing: save_revision gains
new_rev, filing under exactly that number and raising (instead of silently using
a different one) if a concurrent save took it — so the header can never disagree
with the revision folder it lands in.

Co-Authored-By: Claude Opus 4.8 <noreply@anthropic.com>
</commit_message>
<xml_diff>
--- a/app/modules/sam_report/assets/report_template.docx
+++ b/app/modules/sam_report/assets/report_template.docx
@@ -3015,7 +3015,8 @@
       </w:tc>
       <w:tc>
         <w:tcPr>
-          <w:tcW w:w="1080" w:type="dxa"/>
+          <w:tcW w:w="4502" w:type="dxa"/>
+          <w:gridSpan w:val="4"/>
           <w:tcBorders>
             <w:top w:val="single" w:sz="6" w:space="0" w:color="auto"/>
             <w:left w:val="single" w:sz="6" w:space="0" w:color="auto"/>
@@ -3039,134 +3040,8 @@
               <w:b/>
               <w:sz w:val="13"/>
             </w:rPr>
-            <w:t>0</w:t>
+            <w:t>«REVISION»</w:t>
           </w:r>
-        </w:p>
-        <w:p>
-          <w:pPr>
-            <w:spacing w:line="240" w:lineRule="exact"/>
-            <w:rPr>
-              <w:rFonts w:ascii="Jost" w:hAnsi="Jost" w:cs="Jost"/>
-              <w:b/>
-            </w:rPr>
-          </w:pPr>
-        </w:p>
-      </w:tc>
-      <w:tc>
-        <w:tcPr>
-          <w:tcW w:w="1125" w:type="dxa"/>
-          <w:tcBorders>
-            <w:top w:val="single" w:sz="6" w:space="0" w:color="auto"/>
-            <w:left w:val="single" w:sz="6" w:space="0" w:color="auto"/>
-            <w:bottom w:val="single" w:sz="6" w:space="0" w:color="auto"/>
-            <w:right w:val="single" w:sz="6" w:space="0" w:color="auto"/>
-          </w:tcBorders>
-        </w:tcPr>
-        <w:p>
-          <w:pPr>
-            <w:spacing w:line="240" w:lineRule="exact"/>
-            <w:jc w:val="center"/>
-            <w:rPr>
-              <w:rFonts w:ascii="Jost" w:hAnsi="Jost" w:cs="Jost"/>
-              <w:b/>
-              <w:sz w:val="13"/>
-            </w:rPr>
-          </w:pPr>
-          <w:r>
-            <w:rPr>
-              <w:rFonts w:ascii="Jost" w:hAnsi="Jost" w:cs="Jost"/>
-              <w:b/>
-              <w:sz w:val="13"/>
-            </w:rPr>
-            <w:t>1</w:t>
-          </w:r>
-        </w:p>
-        <w:p>
-          <w:pPr>
-            <w:spacing w:line="240" w:lineRule="exact"/>
-            <w:rPr>
-              <w:rFonts w:ascii="Jost" w:hAnsi="Jost" w:cs="Jost"/>
-              <w:b/>
-            </w:rPr>
-          </w:pPr>
-        </w:p>
-      </w:tc>
-      <w:tc>
-        <w:tcPr>
-          <w:tcW w:w="1217" w:type="dxa"/>
-          <w:tcBorders>
-            <w:top w:val="single" w:sz="6" w:space="0" w:color="auto"/>
-            <w:left w:val="single" w:sz="6" w:space="0" w:color="auto"/>
-            <w:bottom w:val="single" w:sz="6" w:space="0" w:color="auto"/>
-            <w:right w:val="single" w:sz="6" w:space="0" w:color="auto"/>
-          </w:tcBorders>
-        </w:tcPr>
-        <w:p>
-          <w:pPr>
-            <w:spacing w:line="240" w:lineRule="exact"/>
-            <w:jc w:val="center"/>
-            <w:rPr>
-              <w:rFonts w:ascii="Jost" w:hAnsi="Jost" w:cs="Jost"/>
-              <w:b/>
-              <w:sz w:val="13"/>
-            </w:rPr>
-          </w:pPr>
-          <w:r>
-            <w:rPr>
-              <w:rFonts w:ascii="Jost" w:hAnsi="Jost" w:cs="Jost"/>
-              <w:b/>
-              <w:sz w:val="13"/>
-            </w:rPr>
-            <w:t>2</w:t>
-          </w:r>
-        </w:p>
-        <w:p>
-          <w:pPr>
-            <w:spacing w:line="240" w:lineRule="exact"/>
-            <w:rPr>
-              <w:rFonts w:ascii="Jost" w:hAnsi="Jost" w:cs="Jost"/>
-              <w:b/>
-            </w:rPr>
-          </w:pPr>
-        </w:p>
-      </w:tc>
-      <w:tc>
-        <w:tcPr>
-          <w:tcW w:w="1080" w:type="dxa"/>
-          <w:tcBorders>
-            <w:top w:val="single" w:sz="6" w:space="0" w:color="auto"/>
-            <w:left w:val="single" w:sz="6" w:space="0" w:color="auto"/>
-            <w:bottom w:val="single" w:sz="6" w:space="0" w:color="auto"/>
-            <w:right w:val="single" w:sz="6" w:space="0" w:color="auto"/>
-          </w:tcBorders>
-        </w:tcPr>
-        <w:p>
-          <w:pPr>
-            <w:spacing w:line="240" w:lineRule="exact"/>
-            <w:jc w:val="center"/>
-            <w:rPr>
-              <w:rFonts w:ascii="Jost" w:hAnsi="Jost" w:cs="Jost"/>
-              <w:b/>
-            </w:rPr>
-          </w:pPr>
-          <w:r>
-            <w:rPr>
-              <w:rFonts w:ascii="Jost" w:hAnsi="Jost" w:cs="Jost"/>
-              <w:b/>
-              <w:sz w:val="13"/>
-            </w:rPr>
-            <w:t>3</w:t>
-          </w:r>
-        </w:p>
-        <w:p>
-          <w:pPr>
-            <w:spacing w:line="240" w:lineRule="exact"/>
-            <w:jc w:val="center"/>
-            <w:rPr>
-              <w:rFonts w:ascii="Jost" w:hAnsi="Jost" w:cs="Jost"/>
-              <w:b/>
-            </w:rPr>
-          </w:pPr>
         </w:p>
       </w:tc>
       <w:tc>

</xml_diff>

<commit_message>
SAM report: make the whole report Jost (fix alignment/spacing)
The template still carried non-Jost fonts: the theme font was Calibri (42 runs
inherited it via asciiTheme), plus Microsoft Sans Serif, Segoe UI and Tahoma.
On Azure/LibreOffice — which has Jost but NOT Calibri/MS Sans Serif — those runs
fell back to a default font with different metrics, throwing off alignment and
spacing and making the report look mixed-font.

Convert every visible typeface to Jost, including the theme major/minor Latin
fonts (so theme-inheriting runs render Jost too). "Cambria Math" is preserved
for the equation. build_template.py updated to reproduce this.

Co-Authored-By: Claude Opus 4.8 <noreply@anthropic.com>
</commit_message>
<xml_diff>
--- a/app/modules/sam_report/assets/report_template.docx
+++ b/app/modules/sam_report/assets/report_template.docx
@@ -58,14 +58,14 @@
                 <w:pPr>
                   <w:spacing w:line="276" w:lineRule="auto"/>
                   <w:rPr>
-                    <w:rFonts w:ascii="Microsoft Sans Serif" w:hAnsi="Microsoft Sans Serif"/>
+                    <w:rFonts w:ascii="Jost" w:hAnsi="Jost"/>
                     <w:color w:val="FFFFFF"/>
                     <w:sz w:val="22"/>
                   </w:rPr>
                 </w:pPr>
                 <w:r>
                   <w:rPr>
-                    <w:rFonts w:ascii="Microsoft Sans Serif" w:hAnsi="Microsoft Sans Serif"/>
+                    <w:rFonts w:ascii="Jost" w:hAnsi="Jost"/>
                     <w:noProof/>
                     <w:color w:val="FFFFFF"/>
                     <w:sz w:val="22"/>
@@ -141,7 +141,7 @@
                 <w:pPr>
                   <w:spacing w:line="276" w:lineRule="auto"/>
                   <w:rPr>
-                    <w:rFonts w:ascii="Microsoft Sans Serif" w:hAnsi="Microsoft Sans Serif"/>
+                    <w:rFonts w:ascii="Jost" w:hAnsi="Jost"/>
                     <w:color w:val="FFFFFF"/>
                     <w:sz w:val="22"/>
                   </w:rPr>
@@ -151,7 +151,7 @@
                 <w:pPr>
                   <w:spacing w:line="276" w:lineRule="auto"/>
                   <w:rPr>
-                    <w:rFonts w:ascii="Microsoft Sans Serif" w:hAnsi="Microsoft Sans Serif"/>
+                    <w:rFonts w:ascii="Jost" w:hAnsi="Jost"/>
                     <w:color w:val="FFFFFF"/>
                     <w:sz w:val="22"/>
                   </w:rPr>
@@ -160,7 +160,7 @@
                 <w:bookmarkEnd w:id="0"/>
                 <w:r>
                   <w:rPr>
-                    <w:rFonts w:ascii="Microsoft Sans Serif" w:hAnsi="Microsoft Sans Serif"/>
+                    <w:rFonts w:ascii="Jost" w:hAnsi="Jost"/>
                     <w:noProof/>
                     <w:color w:val="FFFFFF"/>
                     <w:sz w:val="22"/>
@@ -457,7 +457,7 @@
                 <w:pPr>
                   <w:spacing w:line="276" w:lineRule="auto"/>
                   <w:rPr>
-                    <w:rFonts w:ascii="Microsoft Sans Serif" w:hAnsi="Microsoft Sans Serif"/>
+                    <w:rFonts w:ascii="Jost" w:hAnsi="Jost"/>
                     <w:noProof/>
                     <w:color w:val="FFFFFF"/>
                     <w:sz w:val="22"/>
@@ -465,7 +465,7 @@
                 </w:pPr>
                 <w:r>
                   <w:rPr>
-                    <w:rFonts w:ascii="Microsoft Sans Serif" w:hAnsi="Microsoft Sans Serif"/>
+                    <w:rFonts w:ascii="Jost" w:hAnsi="Jost"/>
                     <w:noProof/>
                     <w:color w:val="FFFFFF"/>
                     <w:sz w:val="22"/>
@@ -944,7 +944,7 @@
                 <w:pPr>
                   <w:spacing w:line="276" w:lineRule="auto"/>
                   <w:rPr>
-                    <w:rFonts w:ascii="Microsoft Sans Serif" w:hAnsi="Microsoft Sans Serif"/>
+                    <w:rFonts w:ascii="Jost" w:hAnsi="Jost"/>
                     <w:noProof/>
                     <w:color w:val="FFFFFF"/>
                     <w:sz w:val="22"/>
@@ -6085,7 +6085,7 @@
       <w:shd w:val="clear" w:color="auto" w:fill="000080"/>
     </w:pPr>
     <w:rPr>
-      <w:rFonts w:ascii="Tahoma" w:hAnsi="Tahoma"/>
+      <w:rFonts w:ascii="Jost" w:hAnsi="Jost"/>
     </w:rPr>
   </w:style>
   <w:style w:type="paragraph" w:styleId="BodyTextIndent2">
@@ -6250,7 +6250,7 @@
     <w:unhideWhenUsed/>
     <w:rsid w:val="004B2BDC"/>
     <w:rPr>
-      <w:rFonts w:ascii="Segoe UI" w:hAnsi="Segoe UI" w:cs="Segoe UI"/>
+      <w:rFonts w:ascii="Jost" w:hAnsi="Jost" w:cs="Jost"/>
       <w:sz w:val="18"/>
       <w:szCs w:val="18"/>
     </w:rPr>
@@ -6262,7 +6262,7 @@
     <w:semiHidden/>
     <w:rsid w:val="004B2BDC"/>
     <w:rPr>
-      <w:rFonts w:ascii="Segoe UI" w:hAnsi="Segoe UI" w:cs="Segoe UI"/>
+      <w:rFonts w:ascii="Jost" w:hAnsi="Jost" w:cs="Jost"/>
       <w:sz w:val="18"/>
       <w:szCs w:val="18"/>
     </w:rPr>
@@ -6490,7 +6490,7 @@
     </a:clrScheme>
     <a:fontScheme name="Office">
       <a:majorFont>
-        <a:latin typeface="Calibri Light" panose="020F0302020204030204"/>
+        <a:latin typeface="Jost" panose="020F0302020204030204"/>
         <a:ea typeface=""/>
         <a:cs typeface=""/>
         <a:font script="Jpan" typeface="游ゴシック Light"/>
@@ -6542,7 +6542,7 @@
         <a:font script="Tfng" typeface="Ebrima"/>
       </a:majorFont>
       <a:minorFont>
-        <a:latin typeface="Calibri" panose="020F0502020204030204"/>
+        <a:latin typeface="Jost" panose="020F0502020204030204"/>
         <a:ea typeface=""/>
         <a:cs typeface=""/>
         <a:font script="Jpan" typeface="游明朝"/>

</xml_diff>

<commit_message>
SAM report: remove broken APPENDIX Excel link (Error! Not a valid link)
The template's APPENDIX carried a leftover OLE LINK field to an external Excel
(LINK Excel.Sheet.12 "Book1" ...) from the source Franklin report. With no valid
source, Word/LibreOffice render it as "Error! Not a valid link." on the last page
of every report. Removed the whole field (spans two paragraphs), leaving a clean
empty appendix. build_template.py updated to strip it on rebuild.

Co-Authored-By: Claude Opus 4.8 <noreply@anthropic.com>
</commit_message>
<xml_diff>
--- a/app/modules/sam_report/assets/report_template.docx
+++ b/app/modules/sam_report/assets/report_template.docx
@@ -2496,27 +2496,6 @@
           <w:sz w:val="20"/>
         </w:rPr>
       </w:pPr>
-      <w:r>
-        <w:fldChar w:fldCharType="begin"/>
-        <w:instrText xml:space="preserve"> LINK Excel.Sheet.12 "Book1" "Sheet1!R1C1:R30C9" \a \f 4 \h </w:instrText>
-        <w:fldChar w:fldCharType="separate"/>
-      </w:r>
-    </w:p>
-    <w:p>
-      <w:pPr>
-        <w:spacing w:after="160" w:line="259" w:lineRule="auto"/>
-        <w:rPr>
-          <w:rFonts w:ascii="Jost" w:hAnsi="Jost"/>
-          <w:sz w:val="22"/>
-        </w:rPr>
-      </w:pPr>
-      <w:r>
-        <w:rPr>
-          <w:rFonts w:ascii="Jost" w:hAnsi="Jost"/>
-          <w:sz w:val="22"/>
-        </w:rPr>
-        <w:fldChar w:fldCharType="end"/>
-      </w:r>
     </w:p>
     <w:sectPr>
       <w:headerReference w:type="default" r:id="rId9"/>

</xml_diff>

<commit_message>
SAM report: put the Table of Contents on its own page (page 2)
The TOC rendered on the cover page (page 1), squeezed under the cover box and
spilling one entry to page 2 — looked like a mistake. Insert a page break
between the cover and the TOC so the cover is alone on page 1 and the full TOC
sits on page 2. Uses a standalone break paragraph (not a TOC entry) so it
survives the TOC field regeneration during PDF conversion. build_template.py
mirrors it.

Co-Authored-By: Claude Opus 4.8 <noreply@anthropic.com>
</commit_message>
<xml_diff>
--- a/app/modules/sam_report/assets/report_template.docx
+++ b/app/modules/sam_report/assets/report_template.docx
@@ -971,6 +971,11 @@
         </w:p>
       </w:sdtContent>
     </w:sdt>
+    <w:p>
+      <w:r>
+        <w:br w:type="page"/>
+      </w:r>
+    </w:p>
     <w:p>
       <w:pPr>
         <w:pStyle w:val="TOC1"/>

</xml_diff>

<commit_message>
Clean the Method-of-analysis sentence in the report templates
The Isc paragraph read "...using a three-hour rolling average First, the
three-hour rolling average of inverter current values was calculated..." — a
run-on (missing sentence break) with a redundant repeat. Fixed the source text in
report_template.docx (the classic body the modern template is built from) and
regenerated report_template_modern.docx:

  "...the current was determined using a three-hour rolling average. First, the
   rolling average of the inverter current values was calculated, and then the
   maximum value of this average was identified and presented as the output."

Co-Authored-By: Claude Opus 4.8 <noreply@anthropic.com>
</commit_message>
<xml_diff>
--- a/app/modules/sam_report/assets/report_template.docx
+++ b/app/modules/sam_report/assets/report_template.docx
@@ -1508,7 +1508,7 @@
           <w:rFonts w:ascii="Jost" w:hAnsi="Jost"/>
           <w:sz w:val="22"/>
         </w:rPr>
-        <w:t>Site-specific information, including the module model, DC/AC ratio, ground coverage ratio (GCR), and inverter model, was provided by the client. Using these parameters, a SAM model was developed, and «NUM_RUNS» simulations were conducted based on available data from «YEAR_START» to «YEAR_END». The maximum Voc for each year was calculated, and the worst-case scenario was identified and presented as the output. A similar method was applied to evaluate Isc; however, the current was determined using a three-hour rolling average</w:t>
+        <w:t>Site-specific information, including the module model, DC/AC ratio, ground coverage ratio (GCR), and inverter model, was provided by the client. Using these parameters, a SAM model was developed, and «NUM_RUNS» simulations were conducted based on available data from «YEAR_START» to «YEAR_END». The maximum Voc for each year was calculated, and the worst-case scenario was identified and presented as the output. A similar method was applied to evaluate Isc; however, the current was determined using a three-hour rolling average.</w:t>
       </w:r>
       <w:r>
         <w:t xml:space="preserve"> </w:t>
@@ -1518,7 +1518,7 @@
           <w:rFonts w:ascii="Jost" w:hAnsi="Jost"/>
           <w:sz w:val="22"/>
         </w:rPr>
-        <w:t>First, the three-hour rolling average of inverter current values was calculated, and then the maximum value of this average was identified and presented as the output.</w:t>
+        <w:t>First, the rolling average of the inverter current values was calculated, and then the maximum value of this average was identified and presented as the output.</w:t>
       </w:r>
     </w:p>
     <w:p>

</xml_diff>